<commit_message>
Preenche dados verificados de referências no TCC de acidentes
- AEAT 2023: 732.751 acidentes no ano-base 2023 (Brasil, 2024a); NR-1
  passa a Brasil, 2024b para desambiguar
- NR-35: redação da Portaria MTP nº 4.218/2022
- Treml et al. (2025): v. 23, n. 3, e220251479, DOI
- Porto (2024): Cad. Saúde Pública v. 40, n. 5, e00169123, DOI
- Data de acesso da matéria da Agência Brasil

Co-Authored-By: Claude Opus 5.5 <noreply@anthropic.com>
Claude-Session: https://claude.ai/code/session_01YQtXhiTtR6MbQyro1e4EQp
</commit_message>
<xml_diff>
--- a/docs/tcc/TCC_Acidentes_ArvoreCausas_MODELO.docx
+++ b/docs/tcc/TCC_Acidentes_ArvoreCausas_MODELO.docx
@@ -866,37 +866,7 @@
         <w:jc w:val="both"/>
       </w:pPr>
       <w:r>
-        <w:t xml:space="preserve">Os acidentes do trabalho permanecem entre os principais problemas de saúde pública e de gestão nas organizações brasileiras. Os registros oficiais do Anuário Estatístico de Acidentes do Trabalho contabilizam </w:t>
-      </w:r>
-      <w:r>
-        <w:rPr>
-          <w:b/>
-          <w:highlight w:val="yellow"/>
-        </w:rPr>
-        <w:t>[PREENCHER: número de acidentes registrados no AEAT mais recente]</w:t>
-      </w:r>
-      <w:r>
-        <w:t xml:space="preserve"> ocorrências no ano-base </w:t>
-      </w:r>
-      <w:r>
-        <w:rPr>
-          <w:b/>
-          <w:highlight w:val="yellow"/>
-        </w:rPr>
-        <w:t>[PREENCHER: ano]</w:t>
-      </w:r>
-      <w:r>
-        <w:t xml:space="preserve"> (Brasil, </w:t>
-      </w:r>
-      <w:r>
-        <w:rPr>
-          <w:b/>
-          <w:highlight w:val="yellow"/>
-        </w:rPr>
-        <w:t>[PREENCHER: ano da edição]</w:t>
-      </w:r>
-      <w:r>
-        <w:t>), número que subestima a realidade, pois os eventos sem afastamento e os quase acidentes raramente chegam às estatísticas (Almeida, 2006).</w:t>
+        <w:t>Os acidentes do trabalho permanecem entre os principais problemas de saúde pública e de gestão nas organizações brasileiras. Os registros oficiais do Anuário Estatístico de Acidentes do Trabalho contabilizam 732.751 acidentes do trabalho no ano-base 2023, alta de cerca de 12% em relação a 2022 (Brasil, 2024a), número que subestima a realidade, pois os eventos sem afastamento e os quase acidentes raramente chegam às estatísticas (Almeida, 2006).</w:t>
       </w:r>
     </w:p>
     <w:p>
@@ -914,7 +884,7 @@
         <w:jc w:val="both"/>
       </w:pPr>
       <w:r>
-        <w:t>A Norma Regulamentadora nº 1 (NR-1), na redação vigente, insere a análise de acidentes no núcleo do Gerenciamento de Riscos Ocupacionais (GRO): o empregador deve analisar os acidentes e as doenças relacionadas ao trabalho, identificar suas causas e utilizar os resultados na revisão do levantamento de perigos e do Programa de Gerenciamento de Riscos (PGR) (Brasil, 2024). A obrigação, portanto, não termina na emissão da Comunicação de Acidente de Trabalho (CAT): exige investigação com método, registro rastreável e realimentação do inventário de riscos.</w:t>
+        <w:t>A Norma Regulamentadora nº 1 (NR-1), na redação vigente, insere a análise de acidentes no núcleo do Gerenciamento de Riscos Ocupacionais (GRO): o empregador deve analisar os acidentes e as doenças relacionadas ao trabalho, identificar suas causas e utilizar os resultados na revisão do levantamento de perigos e do Programa de Gerenciamento de Riscos (PGR) (Brasil, 2024b). A obrigação, portanto, não termina na emissão da Comunicação de Acidente de Trabalho (CAT): exige investigação com método, registro rastreável e realimentação do inventário de riscos.</w:t>
       </w:r>
     </w:p>
     <w:p>
@@ -1021,7 +991,7 @@
         <w:jc w:val="both"/>
       </w:pPr>
       <w:r>
-        <w:t>Há também uma lacuna prática. A NR-1 obriga a análise de acidentes como insumo do GRO (Brasil, 2024), e o método da árvore de causas está consolidado na literatura brasileira desde a década de 1990 (Binder; Monteau; Almeida, 1995), mas faltam ferramentas digitais acessíveis que o levem ao campo: soluções comerciais de gestão de ocorrências têm custo incompatível com organizações menores, e o registro em papel fragiliza a rastreabilidade. Este trabalho demonstra a viabilidade de uma solução de custo praticamente nulo, replicável por profissionais de SST sem apoio de equipe de tecnologia da informação.</w:t>
+        <w:t>Há também uma lacuna prática. A NR-1 obriga a análise de acidentes como insumo do GRO (Brasil, 2024b), e o método da árvore de causas está consolidado na literatura brasileira desde a década de 1990 (Binder; Monteau; Almeida, 1995), mas faltam ferramentas digitais acessíveis que o levem ao campo: soluções comerciais de gestão de ocorrências têm custo incompatível com organizações menores, e o registro em papel fragiliza a rastreabilidade. Este trabalho demonstra a viabilidade de uma solução de custo praticamente nulo, replicável por profissionais de SST sem apoio de equipe de tecnologia da informação.</w:t>
       </w:r>
     </w:p>
     <w:p>
@@ -1286,7 +1256,7 @@
         <w:jc w:val="both"/>
       </w:pPr>
       <w:r>
-        <w:t>A investigação que chega às causas básicas encontra, com frequência, fatores humanos e organizacionais: jornadas extensas, pressão de tempo, sobreaviso, fadiga e estados de esgotamento que degradam a atenção e a tomada de decisão (Reason, 1997). A NR-1, na redação dada pela Portaria MTE nº 1.419/2024, passou a exigir a inclusão dos fatores de risco psicossocial no GRO (Brasil, 2024) — exigência que conversa diretamente com a análise de acidentes, pois os mesmos fatores que adoecem contribuem para eventos agudos.</w:t>
+        <w:t>A investigação que chega às causas básicas encontra, com frequência, fatores humanos e organizacionais: jornadas extensas, pressão de tempo, sobreaviso, fadiga e estados de esgotamento que degradam a atenção e a tomada de decisão (Reason, 1997). A NR-1, na redação dada pela Portaria MTE nº 1.419/2024, passou a exigir a inclusão dos fatores de risco psicossocial no GRO (Brasil, 2024b) — exigência que conversa diretamente com a análise de acidentes, pois os mesmos fatores que adoecem contribuem para eventos agudos.</w:t>
       </w:r>
     </w:p>
     <w:p>
@@ -1376,17 +1346,7 @@
         <w:jc w:val="both"/>
       </w:pPr>
       <w:r>
-        <w:t xml:space="preserve">O arcabouço normativo articula a base legal, a camada regulamentar, a camada técnica e a camada setorial, sintetizadas no Quadro 1, que relaciona cada instrumento à funcionalidade correspondente do sistema desenvolvido. A Lei nº 8.213/1991 obriga a emissão da CAT até o primeiro dia útil seguinte à ocorrência e imediatamente em caso de óbito (Brasil, 1991); a NR-1 exige a análise de acidentes com realimentação do PGR (Brasil, 2024); a NR-10 e a NR-35 regem as atividades típicas da distribuição de energia (Brasil, 2019; Brasil, </w:t>
-      </w:r>
-      <w:r>
-        <w:rPr>
-          <w:b/>
-          <w:highlight w:val="yellow"/>
-        </w:rPr>
-        <w:t>[PREENCHER: ano da NR-35 consultada]</w:t>
-      </w:r>
-      <w:r>
-        <w:t>).</w:t>
+        <w:t>O arcabouço normativo articula a base legal, a camada regulamentar, a camada técnica e a camada setorial, sintetizadas no Quadro 1, que relaciona cada instrumento à funcionalidade correspondente do sistema desenvolvido. A Lei nº 8.213/1991 obriga a emissão da CAT até o primeiro dia útil seguinte à ocorrência e imediatamente em caso de óbito (Brasil, 1991); a NR-1 exige a análise de acidentes com realimentação do PGR (Brasil, 2024b); a NR-10 e a NR-35 regem as atividades típicas da distribuição de energia (Brasil, 2019; 2022).</w:t>
       </w:r>
     </w:p>
     <w:p>
@@ -1761,7 +1721,7 @@
         <w:rPr>
           <w:sz w:val="20"/>
         </w:rPr>
-        <w:t>Fonte: Elaborado pelo autor com base em Brasil (1991; 2019; 2024) e Associação Brasileira de Normas Técnicas (2001; 2018).</w:t>
+        <w:t>Fonte: Elaborado pelo autor com base em Brasil (1991; 2019; 2024b) e Associação Brasileira de Normas Técnicas (2001; 2018).</w:t>
       </w:r>
     </w:p>
     <w:p>
@@ -1859,7 +1819,7 @@
         <w:jc w:val="both"/>
       </w:pPr>
       <w:r>
-        <w:t>Em síntese, três conclusões da revisão orientam o desenvolvimento: o modelo causal adotado determina a qualidade da investigação, e a árvore de causas é o antídoto metodológico consolidado ao paradigma culpabilizador (Binder; Almeida, 1997); o quase acidente é o insumo mais abundante do aprendizado, mas exige reporte fácil e imediato (Bird; Germain, 1985); e a exigência da NR-1 de analisar ocorrências e realimentar o PGR demanda registro rastreável (Brasil, 2024). Esses pontos definem os requisitos do sistema apresentado na seção 3.</w:t>
+        <w:t>Em síntese, três conclusões da revisão orientam o desenvolvimento: o modelo causal adotado determina a qualidade da investigação, e a árvore de causas é o antídoto metodológico consolidado ao paradigma culpabilizador (Binder; Almeida, 1997); o quase acidente é o insumo mais abundante do aprendizado, mas exige reporte fácil e imediato (Bird; Germain, 1985); e a exigência da NR-1 de analisar ocorrências e realimentar o PGR demanda registro rastreável (Brasil, 2024b). Esses pontos definem os requisitos do sistema apresentado na seção 3.</w:t>
       </w:r>
     </w:p>
     <w:p>
@@ -2870,7 +2830,7 @@
         <w:jc w:val="both"/>
       </w:pPr>
       <w:r>
-        <w:t>A permissão de trabalho digital apresenta checklist específico por tipo de serviço — rede desenergizada, com a sequência de desenergização da NR-10; rede energizada; e trabalho em altura —, com captura de geolocalização e assinatura em tela (Brasil, 2019). A avaliação de fatores psicossociais aplica instrumento anônimo de dez itens em seis dimensões, com classificação automática, atendendo à exigência da NR-1 (Brasil, 2024). A avaliação ergonômica preliminar emprega formulário de doze itens em cinco blocos com parecer automático. A integração permite verificar, por exemplo, se um acidente ocorreu em serviço coberto por permissão e se o setor envolvido já sinalizava sobrecarga.</w:t>
+        <w:t>A permissão de trabalho digital apresenta checklist específico por tipo de serviço — rede desenergizada, com a sequência de desenergização da NR-10; rede energizada; e trabalho em altura —, com captura de geolocalização e assinatura em tela (Brasil, 2019). A avaliação de fatores psicossociais aplica instrumento anônimo de dez itens em seis dimensões, com classificação automática, atendendo à exigência da NR-1 (Brasil, 2024b). A avaliação ergonômica preliminar emprega formulário de doze itens em cinco blocos com parecer automático. A integração permite verificar, por exemplo, se um acidente ocorreu em serviço coberto por permissão e se o setor envolvido já sinalizava sobrecarga.</w:t>
       </w:r>
     </w:p>
     <w:p>
@@ -4101,7 +4061,7 @@
         <w:jc w:val="both"/>
       </w:pPr>
       <w:r>
-        <w:t xml:space="preserve">As causas básicas consolidadas realimentam o inventário de riscos: cada fator organizacional recorrente identificado nas investigações é candidato a perigo a reavaliar no inventário, e as ações vinculadas compõem o plano de ação do PGR com responsáveis e prazos — o ciclo que a NR-1 exige (Brasil, 2024). </w:t>
+        <w:t xml:space="preserve">As causas básicas consolidadas realimentam o inventário de riscos: cada fator organizacional recorrente identificado nas investigações é candidato a perigo a reavaliar no inventário, e as ações vinculadas compõem o plano de ação do PGR com responsáveis e prazos — o ciclo que a NR-1 exige (Brasil, 2024b). </w:t>
       </w:r>
       <w:r>
         <w:rPr>
@@ -4253,7 +4213,225 @@
         <w:t>Agência Brasil</w:t>
       </w:r>
       <w:r>
-        <w:t xml:space="preserve">, Brasília, DF, jul. 2024. Disponível em: https://agenciabrasil.ebc.com.br/geral/noticia/2024-07/acidentes-fatais-com-rede-eletrica-caem-8-em-2023-aponta-abradee. Acesso em: </w:t>
+        <w:t>, Brasília, DF, jul. 2024. Disponível em: https://agenciabrasil.ebc.com.br/geral/noticia/2024-07/acidentes-fatais-com-rede-eletrica-caem-8-em-2023-aponta-abradee. Acesso em: 8 out. 2026.</w:t>
+      </w:r>
+    </w:p>
+    <w:p>
+      <w:pPr>
+        <w:spacing w:line="240" w:lineRule="auto" w:after="240"/>
+        <w:jc w:val="left"/>
+      </w:pPr>
+      <w:r>
+        <w:t xml:space="preserve">ALMEIDA, I. M. Trajetória da análise de acidentes: o paradigma tradicional e os primórdios da ampliação da análise. </w:t>
+      </w:r>
+      <w:r>
+        <w:rPr>
+          <w:b/>
+        </w:rPr>
+        <w:t>Interface</w:t>
+      </w:r>
+      <w:r>
+        <w:t>: comunicação, saúde, educação, Botucatu, v. 10, n. 19, p. 185-202, 2006. DOI: 10.1590/S1414-32832006000100013.</w:t>
+      </w:r>
+    </w:p>
+    <w:p>
+      <w:pPr>
+        <w:spacing w:line="240" w:lineRule="auto" w:after="240"/>
+        <w:jc w:val="left"/>
+      </w:pPr>
+      <w:r>
+        <w:t xml:space="preserve">ALMEIDA, I. M.; VILELA, R. A. G. </w:t>
+      </w:r>
+      <w:r>
+        <w:rPr>
+          <w:b/>
+        </w:rPr>
+        <w:t>Modelo de análise e prevenção de acidentes de trabalho</w:t>
+      </w:r>
+      <w:r>
+        <w:t>: MAPA. Piracicaba: CEREST, 2010.</w:t>
+      </w:r>
+    </w:p>
+    <w:p>
+      <w:pPr>
+        <w:spacing w:line="240" w:lineRule="auto" w:after="240"/>
+        <w:jc w:val="left"/>
+      </w:pPr>
+      <w:r>
+        <w:t xml:space="preserve">ALMEIDA, I. M. et al. Modelo de Análise e Prevenção de Acidentes - MAPA: ferramenta para a vigilância em saúde do trabalhador. </w:t>
+      </w:r>
+      <w:r>
+        <w:rPr>
+          <w:b/>
+        </w:rPr>
+        <w:t>Ciência &amp; Saúde Coletiva</w:t>
+      </w:r>
+      <w:r>
+        <w:t>, Rio de Janeiro, v. 19, n. 12, p. 4679-4688, 2014.</w:t>
+      </w:r>
+    </w:p>
+    <w:p>
+      <w:pPr>
+        <w:spacing w:line="240" w:lineRule="auto" w:after="240"/>
+        <w:jc w:val="left"/>
+      </w:pPr>
+      <w:r>
+        <w:t xml:space="preserve">ASSOCIAÇÃO BRASILEIRA DE NORMAS TÉCNICAS. </w:t>
+      </w:r>
+      <w:r>
+        <w:rPr>
+          <w:b/>
+        </w:rPr>
+        <w:t>NBR 14280</w:t>
+      </w:r>
+      <w:r>
+        <w:t>: cadastro de acidente do trabalho: procedimento e classificação. Rio de Janeiro: ABNT, 2001.</w:t>
+      </w:r>
+    </w:p>
+    <w:p>
+      <w:pPr>
+        <w:spacing w:line="240" w:lineRule="auto" w:after="240"/>
+        <w:jc w:val="left"/>
+      </w:pPr>
+      <w:r>
+        <w:t xml:space="preserve">ASSOCIAÇÃO BRASILEIRA DE NORMAS TÉCNICAS. </w:t>
+      </w:r>
+      <w:r>
+        <w:rPr>
+          <w:b/>
+        </w:rPr>
+        <w:t>NBR ISO 45001</w:t>
+      </w:r>
+      <w:r>
+        <w:t>: sistemas de gestão de saúde e segurança ocupacional: requisitos com orientação para uso. Rio de Janeiro: ABNT, 2018.</w:t>
+      </w:r>
+    </w:p>
+    <w:p>
+      <w:pPr>
+        <w:spacing w:line="240" w:lineRule="auto" w:after="240"/>
+        <w:jc w:val="left"/>
+      </w:pPr>
+      <w:r>
+        <w:t xml:space="preserve">BINDER, M. C. P.; ALMEIDA, I. M. Estudo de caso de dois acidentes do trabalho investigados com o método de árvore de causas. </w:t>
+      </w:r>
+      <w:r>
+        <w:rPr>
+          <w:b/>
+        </w:rPr>
+        <w:t>Cadernos de Saúde Pública</w:t>
+      </w:r>
+      <w:r>
+        <w:t>, Rio de Janeiro, v. 13, n. 4, p. 749-760, 1997.</w:t>
+      </w:r>
+    </w:p>
+    <w:p>
+      <w:pPr>
+        <w:spacing w:line="240" w:lineRule="auto" w:after="240"/>
+        <w:jc w:val="left"/>
+      </w:pPr>
+      <w:r>
+        <w:t xml:space="preserve">BINDER, M. C. P.; MONTEAU, M.; ALMEIDA, I. M. </w:t>
+      </w:r>
+      <w:r>
+        <w:rPr>
+          <w:b/>
+        </w:rPr>
+        <w:t>Árvore de causas</w:t>
+      </w:r>
+      <w:r>
+        <w:t xml:space="preserve">: método de investigação de acidentes de trabalho. São Paulo: Publisher Brasil, 1995. </w:t>
+      </w:r>
+      <w:r>
+        <w:rPr>
+          <w:b/>
+          <w:highlight w:val="yellow"/>
+        </w:rPr>
+        <w:t>[PREENCHER: conferir ano da edição consultada]</w:t>
+      </w:r>
+      <w:r>
+        <w:t>.</w:t>
+      </w:r>
+    </w:p>
+    <w:p>
+      <w:pPr>
+        <w:spacing w:line="240" w:lineRule="auto" w:after="240"/>
+        <w:jc w:val="left"/>
+      </w:pPr>
+      <w:r>
+        <w:t xml:space="preserve">BIRD, F. E.; GERMAIN, G. L. </w:t>
+      </w:r>
+      <w:r>
+        <w:rPr>
+          <w:b/>
+        </w:rPr>
+        <w:t>Practical loss control leadership</w:t>
+      </w:r>
+      <w:r>
+        <w:t>. Loganville: International Loss Control Institute, 1985.</w:t>
+      </w:r>
+    </w:p>
+    <w:p>
+      <w:pPr>
+        <w:spacing w:line="240" w:lineRule="auto" w:after="240"/>
+        <w:jc w:val="left"/>
+      </w:pPr>
+      <w:r>
+        <w:t xml:space="preserve">BRASIL. Lei nº 8.213, de 24 de julho de 1991. Dispõe sobre os Planos de Benefícios da Previdência Social e dá outras providências. </w:t>
+      </w:r>
+      <w:r>
+        <w:rPr>
+          <w:b/>
+        </w:rPr>
+        <w:t>Diário Oficial da União</w:t>
+      </w:r>
+      <w:r>
+        <w:t>: seção 1, Brasília, DF, 25 jul. 1991.</w:t>
+      </w:r>
+    </w:p>
+    <w:p>
+      <w:pPr>
+        <w:spacing w:line="240" w:lineRule="auto" w:after="240"/>
+        <w:jc w:val="left"/>
+      </w:pPr>
+      <w:r>
+        <w:t xml:space="preserve">BRASIL. Lei nº 13.709, de 14 de agosto de 2018. Lei Geral de Proteção de Dados Pessoais (LGPD). </w:t>
+      </w:r>
+      <w:r>
+        <w:rPr>
+          <w:b/>
+        </w:rPr>
+        <w:t>Diário Oficial da União</w:t>
+      </w:r>
+      <w:r>
+        <w:t>: seção 1, Brasília, DF, 15 ago. 2018.</w:t>
+      </w:r>
+    </w:p>
+    <w:p>
+      <w:pPr>
+        <w:spacing w:line="240" w:lineRule="auto" w:after="240"/>
+        <w:jc w:val="left"/>
+      </w:pPr>
+      <w:r>
+        <w:t xml:space="preserve">BRASIL. Ministério da Previdência Social. </w:t>
+      </w:r>
+      <w:r>
+        <w:rPr>
+          <w:b/>
+        </w:rPr>
+        <w:t>Anuário estatístico de acidentes do trabalho</w:t>
+      </w:r>
+      <w:r>
+        <w:t xml:space="preserve">: AEAT 2023. Brasília, DF: MPS, 2024a. Disponível em: </w:t>
+      </w:r>
+      <w:r>
+        <w:rPr>
+          <w:b/>
+          <w:highlight w:val="yellow"/>
+        </w:rPr>
+        <w:t>[PREENCHER: URL]</w:t>
+      </w:r>
+      <w:r>
+        <w:t xml:space="preserve">. Acesso em: </w:t>
       </w:r>
       <w:r>
         <w:rPr>
@@ -4272,16 +4450,16 @@
         <w:jc w:val="left"/>
       </w:pPr>
       <w:r>
-        <w:t xml:space="preserve">ALMEIDA, I. M. Trajetória da análise de acidentes: o paradigma tradicional e os primórdios da ampliação da análise. </w:t>
+        <w:t xml:space="preserve">BRASIL. Ministério do Trabalho e Emprego. </w:t>
       </w:r>
       <w:r>
         <w:rPr>
           <w:b/>
         </w:rPr>
-        <w:t>Interface</w:t>
-      </w:r>
-      <w:r>
-        <w:t>: comunicação, saúde, educação, Botucatu, v. 10, n. 19, p. 185-202, 2006. DOI: 10.1590/S1414-32832006000100013.</w:t>
+        <w:t>NR-1</w:t>
+      </w:r>
+      <w:r>
+        <w:t>: disposições gerais e gerenciamento de riscos ocupacionais. Redação dada pela Portaria MTE nº 1.419, de 27 de agosto de 2024. Brasília, DF: MTE, 2024b.</w:t>
       </w:r>
     </w:p>
     <w:p>
@@ -4290,16 +4468,16 @@
         <w:jc w:val="left"/>
       </w:pPr>
       <w:r>
-        <w:t xml:space="preserve">ALMEIDA, I. M.; VILELA, R. A. G. </w:t>
+        <w:t xml:space="preserve">BRASIL. Ministério do Trabalho e Emprego. </w:t>
       </w:r>
       <w:r>
         <w:rPr>
           <w:b/>
         </w:rPr>
-        <w:t>Modelo de análise e prevenção de acidentes de trabalho</w:t>
-      </w:r>
-      <w:r>
-        <w:t>: MAPA. Piracicaba: CEREST, 2010.</w:t>
+        <w:t>NR-10</w:t>
+      </w:r>
+      <w:r>
+        <w:t>: segurança em instalações e serviços em eletricidade. Brasília, DF: MTE, 2019.</w:t>
       </w:r>
     </w:p>
     <w:p>
@@ -4308,16 +4486,16 @@
         <w:jc w:val="left"/>
       </w:pPr>
       <w:r>
-        <w:t xml:space="preserve">ALMEIDA, I. M. et al. Modelo de Análise e Prevenção de Acidentes - MAPA: ferramenta para a vigilância em saúde do trabalhador. </w:t>
+        <w:t xml:space="preserve">BRASIL. Ministério do Trabalho e Previdência. </w:t>
       </w:r>
       <w:r>
         <w:rPr>
           <w:b/>
         </w:rPr>
-        <w:t>Ciência &amp; Saúde Coletiva</w:t>
-      </w:r>
-      <w:r>
-        <w:t>, Rio de Janeiro, v. 19, n. 12, p. 4679-4688, 2014.</w:t>
+        <w:t>NR-35</w:t>
+      </w:r>
+      <w:r>
+        <w:t>: trabalho em altura. Redação dada pela Portaria MTP nº 4.218, de 20 de dezembro de 2022. Brasília, DF: MTP, 2022.</w:t>
       </w:r>
     </w:p>
     <w:p>
@@ -4326,16 +4504,16 @@
         <w:jc w:val="left"/>
       </w:pPr>
       <w:r>
-        <w:t xml:space="preserve">ASSOCIAÇÃO BRASILEIRA DE NORMAS TÉCNICAS. </w:t>
+        <w:t xml:space="preserve">HEINRICH, H. W. </w:t>
       </w:r>
       <w:r>
         <w:rPr>
           <w:b/>
         </w:rPr>
-        <w:t>NBR 14280</w:t>
-      </w:r>
-      <w:r>
-        <w:t>: cadastro de acidente do trabalho: procedimento e classificação. Rio de Janeiro: ABNT, 2001.</w:t>
+        <w:t>Industrial accident prevention</w:t>
+      </w:r>
+      <w:r>
+        <w:t>: a scientific approach. New York: McGraw-Hill, 1931.</w:t>
       </w:r>
     </w:p>
     <w:p>
@@ -4344,16 +4522,16 @@
         <w:jc w:val="left"/>
       </w:pPr>
       <w:r>
-        <w:t xml:space="preserve">ASSOCIAÇÃO BRASILEIRA DE NORMAS TÉCNICAS. </w:t>
+        <w:t xml:space="preserve">HOLLNAGEL, E. </w:t>
       </w:r>
       <w:r>
         <w:rPr>
           <w:b/>
         </w:rPr>
-        <w:t>NBR ISO 45001</w:t>
-      </w:r>
-      <w:r>
-        <w:t>: sistemas de gestão de saúde e segurança ocupacional: requisitos com orientação para uso. Rio de Janeiro: ABNT, 2018.</w:t>
+        <w:t>Safety-I and Safety-II</w:t>
+      </w:r>
+      <w:r>
+        <w:t>: the past and future of safety management. Farnham: Ashgate, 2014.</w:t>
       </w:r>
     </w:p>
     <w:p>
@@ -4362,7 +4540,43 @@
         <w:jc w:val="left"/>
       </w:pPr>
       <w:r>
-        <w:t xml:space="preserve">BINDER, M. C. P.; ALMEIDA, I. M. Estudo de caso de dois acidentes do trabalho investigados com o método de árvore de causas. </w:t>
+        <w:t xml:space="preserve">LEVESON, N. G. </w:t>
+      </w:r>
+      <w:r>
+        <w:rPr>
+          <w:b/>
+        </w:rPr>
+        <w:t>Engineering a safer world</w:t>
+      </w:r>
+      <w:r>
+        <w:t>: systems thinking applied to safety. Cambridge, MA: MIT Press, 2011.</w:t>
+      </w:r>
+    </w:p>
+    <w:p>
+      <w:pPr>
+        <w:spacing w:line="240" w:lineRule="auto" w:after="240"/>
+        <w:jc w:val="left"/>
+      </w:pPr>
+      <w:r>
+        <w:t xml:space="preserve">ORGANIZAÇÃO MUNDIAL DA SAÚDE. </w:t>
+      </w:r>
+      <w:r>
+        <w:rPr>
+          <w:b/>
+        </w:rPr>
+        <w:t>CID-11</w:t>
+      </w:r>
+      <w:r>
+        <w:t>: Classificação Internacional de Doenças, 11ª revisão: QD85 burn-out. Genebra: OMS, 2019.</w:t>
+      </w:r>
+    </w:p>
+    <w:p>
+      <w:pPr>
+        <w:spacing w:line="240" w:lineRule="auto" w:after="240"/>
+        <w:jc w:val="left"/>
+      </w:pPr>
+      <w:r>
+        <w:t xml:space="preserve">PORTO, M. F. S. Prevention, social emancipation, and paradigmatic transition: a 40-year interdisciplinary Brazilian trajectory on accidents and disasters. </w:t>
       </w:r>
       <w:r>
         <w:rPr>
@@ -4371,311 +4585,7 @@
         <w:t>Cadernos de Saúde Pública</w:t>
       </w:r>
       <w:r>
-        <w:t>, Rio de Janeiro, v. 13, n. 4, p. 749-760, 1997.</w:t>
-      </w:r>
-    </w:p>
-    <w:p>
-      <w:pPr>
-        <w:spacing w:line="240" w:lineRule="auto" w:after="240"/>
-        <w:jc w:val="left"/>
-      </w:pPr>
-      <w:r>
-        <w:t xml:space="preserve">BINDER, M. C. P.; MONTEAU, M.; ALMEIDA, I. M. </w:t>
-      </w:r>
-      <w:r>
-        <w:rPr>
-          <w:b/>
-        </w:rPr>
-        <w:t>Árvore de causas</w:t>
-      </w:r>
-      <w:r>
-        <w:t xml:space="preserve">: método de investigação de acidentes de trabalho. São Paulo: Publisher Brasil, 1995. </w:t>
-      </w:r>
-      <w:r>
-        <w:rPr>
-          <w:b/>
-          <w:highlight w:val="yellow"/>
-        </w:rPr>
-        <w:t>[PREENCHER: conferir ano da edição consultada]</w:t>
-      </w:r>
-      <w:r>
-        <w:t>.</w:t>
-      </w:r>
-    </w:p>
-    <w:p>
-      <w:pPr>
-        <w:spacing w:line="240" w:lineRule="auto" w:after="240"/>
-        <w:jc w:val="left"/>
-      </w:pPr>
-      <w:r>
-        <w:t xml:space="preserve">BIRD, F. E.; GERMAIN, G. L. </w:t>
-      </w:r>
-      <w:r>
-        <w:rPr>
-          <w:b/>
-        </w:rPr>
-        <w:t>Practical loss control leadership</w:t>
-      </w:r>
-      <w:r>
-        <w:t>. Loganville: International Loss Control Institute, 1985.</w:t>
-      </w:r>
-    </w:p>
-    <w:p>
-      <w:pPr>
-        <w:spacing w:line="240" w:lineRule="auto" w:after="240"/>
-        <w:jc w:val="left"/>
-      </w:pPr>
-      <w:r>
-        <w:t xml:space="preserve">BRASIL. Lei nº 8.213, de 24 de julho de 1991. Dispõe sobre os Planos de Benefícios da Previdência Social e dá outras providências. </w:t>
-      </w:r>
-      <w:r>
-        <w:rPr>
-          <w:b/>
-        </w:rPr>
-        <w:t>Diário Oficial da União</w:t>
-      </w:r>
-      <w:r>
-        <w:t>: seção 1, Brasília, DF, 25 jul. 1991.</w:t>
-      </w:r>
-    </w:p>
-    <w:p>
-      <w:pPr>
-        <w:spacing w:line="240" w:lineRule="auto" w:after="240"/>
-        <w:jc w:val="left"/>
-      </w:pPr>
-      <w:r>
-        <w:t xml:space="preserve">BRASIL. Lei nº 13.709, de 14 de agosto de 2018. Lei Geral de Proteção de Dados Pessoais (LGPD). </w:t>
-      </w:r>
-      <w:r>
-        <w:rPr>
-          <w:b/>
-        </w:rPr>
-        <w:t>Diário Oficial da União</w:t>
-      </w:r>
-      <w:r>
-        <w:t>: seção 1, Brasília, DF, 15 ago. 2018.</w:t>
-      </w:r>
-    </w:p>
-    <w:p>
-      <w:pPr>
-        <w:spacing w:line="240" w:lineRule="auto" w:after="240"/>
-        <w:jc w:val="left"/>
-      </w:pPr>
-      <w:r>
-        <w:t xml:space="preserve">BRASIL. Ministério da Previdência Social. </w:t>
-      </w:r>
-      <w:r>
-        <w:rPr>
-          <w:b/>
-        </w:rPr>
-        <w:t>Anuário estatístico de acidentes do trabalho</w:t>
-      </w:r>
-      <w:r>
-        <w:t xml:space="preserve">: AEAT </w:t>
-      </w:r>
-      <w:r>
-        <w:rPr>
-          <w:b/>
-          <w:highlight w:val="yellow"/>
-        </w:rPr>
-        <w:t>[PREENCHER: ano-base]</w:t>
-      </w:r>
-      <w:r>
-        <w:t xml:space="preserve">. Brasília, DF: MPS, </w:t>
-      </w:r>
-      <w:r>
-        <w:rPr>
-          <w:b/>
-          <w:highlight w:val="yellow"/>
-        </w:rPr>
-        <w:t>[PREENCHER: ano]</w:t>
-      </w:r>
-      <w:r>
-        <w:t xml:space="preserve">. Disponível em: </w:t>
-      </w:r>
-      <w:r>
-        <w:rPr>
-          <w:b/>
-          <w:highlight w:val="yellow"/>
-        </w:rPr>
-        <w:t>[PREENCHER: URL]</w:t>
-      </w:r>
-      <w:r>
-        <w:t xml:space="preserve">. Acesso em: </w:t>
-      </w:r>
-      <w:r>
-        <w:rPr>
-          <w:b/>
-          <w:highlight w:val="yellow"/>
-        </w:rPr>
-        <w:t>[PREENCHER: data]</w:t>
-      </w:r>
-      <w:r>
-        <w:t>.</w:t>
-      </w:r>
-    </w:p>
-    <w:p>
-      <w:pPr>
-        <w:spacing w:line="240" w:lineRule="auto" w:after="240"/>
-        <w:jc w:val="left"/>
-      </w:pPr>
-      <w:r>
-        <w:t xml:space="preserve">BRASIL. Ministério do Trabalho e Emprego. </w:t>
-      </w:r>
-      <w:r>
-        <w:rPr>
-          <w:b/>
-        </w:rPr>
-        <w:t>NR-1</w:t>
-      </w:r>
-      <w:r>
-        <w:t>: disposições gerais e gerenciamento de riscos ocupacionais. Redação dada pela Portaria MTE nº 1.419, de 27 de agosto de 2024. Brasília, DF: MTE, 2024.</w:t>
-      </w:r>
-    </w:p>
-    <w:p>
-      <w:pPr>
-        <w:spacing w:line="240" w:lineRule="auto" w:after="240"/>
-        <w:jc w:val="left"/>
-      </w:pPr>
-      <w:r>
-        <w:t xml:space="preserve">BRASIL. Ministério do Trabalho e Emprego. </w:t>
-      </w:r>
-      <w:r>
-        <w:rPr>
-          <w:b/>
-        </w:rPr>
-        <w:t>NR-10</w:t>
-      </w:r>
-      <w:r>
-        <w:t>: segurança em instalações e serviços em eletricidade. Brasília, DF: MTE, 2019.</w:t>
-      </w:r>
-    </w:p>
-    <w:p>
-      <w:pPr>
-        <w:spacing w:line="240" w:lineRule="auto" w:after="240"/>
-        <w:jc w:val="left"/>
-      </w:pPr>
-      <w:r>
-        <w:t xml:space="preserve">BRASIL. Ministério do Trabalho e Emprego. </w:t>
-      </w:r>
-      <w:r>
-        <w:rPr>
-          <w:b/>
-        </w:rPr>
-        <w:t>NR-35</w:t>
-      </w:r>
-      <w:r>
-        <w:t xml:space="preserve">: trabalho em altura. Brasília, DF: MTE, </w:t>
-      </w:r>
-      <w:r>
-        <w:rPr>
-          <w:b/>
-          <w:highlight w:val="yellow"/>
-        </w:rPr>
-        <w:t>[PREENCHER: ano da redação consultada]</w:t>
-      </w:r>
-      <w:r>
-        <w:t>.</w:t>
-      </w:r>
-    </w:p>
-    <w:p>
-      <w:pPr>
-        <w:spacing w:line="240" w:lineRule="auto" w:after="240"/>
-        <w:jc w:val="left"/>
-      </w:pPr>
-      <w:r>
-        <w:t xml:space="preserve">HEINRICH, H. W. </w:t>
-      </w:r>
-      <w:r>
-        <w:rPr>
-          <w:b/>
-        </w:rPr>
-        <w:t>Industrial accident prevention</w:t>
-      </w:r>
-      <w:r>
-        <w:t>: a scientific approach. New York: McGraw-Hill, 1931.</w:t>
-      </w:r>
-    </w:p>
-    <w:p>
-      <w:pPr>
-        <w:spacing w:line="240" w:lineRule="auto" w:after="240"/>
-        <w:jc w:val="left"/>
-      </w:pPr>
-      <w:r>
-        <w:t xml:space="preserve">HOLLNAGEL, E. </w:t>
-      </w:r>
-      <w:r>
-        <w:rPr>
-          <w:b/>
-        </w:rPr>
-        <w:t>Safety-I and Safety-II</w:t>
-      </w:r>
-      <w:r>
-        <w:t>: the past and future of safety management. Farnham: Ashgate, 2014.</w:t>
-      </w:r>
-    </w:p>
-    <w:p>
-      <w:pPr>
-        <w:spacing w:line="240" w:lineRule="auto" w:after="240"/>
-        <w:jc w:val="left"/>
-      </w:pPr>
-      <w:r>
-        <w:t xml:space="preserve">LEVESON, N. G. </w:t>
-      </w:r>
-      <w:r>
-        <w:rPr>
-          <w:b/>
-        </w:rPr>
-        <w:t>Engineering a safer world</w:t>
-      </w:r>
-      <w:r>
-        <w:t>: systems thinking applied to safety. Cambridge, MA: MIT Press, 2011.</w:t>
-      </w:r>
-    </w:p>
-    <w:p>
-      <w:pPr>
-        <w:spacing w:line="240" w:lineRule="auto" w:after="240"/>
-        <w:jc w:val="left"/>
-      </w:pPr>
-      <w:r>
-        <w:t xml:space="preserve">ORGANIZAÇÃO MUNDIAL DA SAÚDE. </w:t>
-      </w:r>
-      <w:r>
-        <w:rPr>
-          <w:b/>
-        </w:rPr>
-        <w:t>CID-11</w:t>
-      </w:r>
-      <w:r>
-        <w:t>: Classificação Internacional de Doenças, 11ª revisão: QD85 burn-out. Genebra: OMS, 2019.</w:t>
-      </w:r>
-    </w:p>
-    <w:p>
-      <w:pPr>
-        <w:spacing w:line="240" w:lineRule="auto" w:after="240"/>
-        <w:jc w:val="left"/>
-      </w:pPr>
-      <w:r>
-        <w:t xml:space="preserve">PORTO, M. F. S. Prevention, social emancipation, and paradigmatic transition: a 40-year interdisciplinary Brazilian trajectory on accidents and disasters. </w:t>
-      </w:r>
-      <w:r>
-        <w:rPr>
-          <w:b/>
-        </w:rPr>
-        <w:t>Cadernos de Saúde Pública</w:t>
-      </w:r>
-      <w:r>
-        <w:t xml:space="preserve">, Rio de Janeiro, 2024. </w:t>
-      </w:r>
-      <w:r>
-        <w:rPr>
-          <w:b/>
-          <w:highlight w:val="yellow"/>
-        </w:rPr>
-        <w:t>[PREENCHER: conferir volume, número e DOI no PubMed, PMID 38775613]</w:t>
-      </w:r>
-      <w:r>
-        <w:t>.</w:t>
+        <w:t>, Rio de Janeiro, v. 40, n. 5, e00169123, 2024. DOI: 10.1590/0102-311XPT169123.</w:t>
       </w:r>
     </w:p>
     <w:p>
@@ -4747,17 +4657,7 @@
         <w:t>Revista Brasileira de Medicina do Trabalho</w:t>
       </w:r>
       <w:r>
-        <w:t xml:space="preserve">, 2025. </w:t>
-      </w:r>
-      <w:r>
-        <w:rPr>
-          <w:b/>
-          <w:highlight w:val="yellow"/>
-        </w:rPr>
-        <w:t>[PREENCHER: conferir volume, número, páginas e DOI]</w:t>
-      </w:r>
-      <w:r>
-        <w:t>.</w:t>
+        <w:t>, São Paulo, v. 23, n. 3, e220251479, 2025. DOI: 10.47626/1679-4435-2025-1479.</w:t>
       </w:r>
     </w:p>
     <w:p>

</xml_diff>